<commit_message>
Fixed typos in Class 24 slides.
</commit_message>
<xml_diff>
--- a/class24w.docx
+++ b/class24w.docx
@@ -1038,7 +1038,7 @@
         <w:pStyle w:val="FirstParagraph"/>
       </w:pPr>
       <w:r>
-        <w:t xml:space="preserve">Jonas Kristoffer Lindelov has built up a terrific resources to explain this at</w:t>
+        <w:t xml:space="preserve">Jonas Kristoffer Lindelov has built up a terrific resource to explain this at</w:t>
       </w:r>
     </w:p>
     <w:p>
@@ -8943,7 +8943,7 @@
         </w:numPr>
       </w:pPr>
       <w:r>
-        <w:t xml:space="preserve">District of Columbia will be down-weighted the most, followed by Vermont, then Alaska and and Mississippi.</w:t>
+        <w:t xml:space="preserve">District of Columbia will be down-weighted the most, followed by Vermont, then Alaska and Mississippi.</w:t>
       </w:r>
     </w:p>
     <w:p>
@@ -16257,7 +16257,7 @@
         <w:rPr>
           <w:rStyle w:val="VerbatimChar"/>
         </w:rPr>
-        <w:t xml:space="preserve">  tinytex_0.57            tools_4.5.2             tzdb_0.5.0             </w:t>
+        <w:t xml:space="preserve">  tinytex_0.58            tools_4.5.2             tzdb_0.5.0             </w:t>
       </w:r>
       <w:r>
         <w:br/>

</xml_diff>